<commit_message>
Update Worker Roster Template
</commit_message>
<xml_diff>
--- a/templates/Worker Roster Template.docx
+++ b/templates/Worker Roster Template.docx
@@ -1056,14 +1056,18 @@
               <w:jc w:val="center"/>
               <w:rPr>
                 <w:rFonts w:ascii="Arial" w:hAnsi="Arial" w:cs="Arial"/>
-                <w:sz w:val="16"/>
-                <w:szCs w:val="16"/>
-              </w:rPr>
-            </w:pPr>
-            <w:r>
-              <w:rPr>
-                <w:rStyle w:val="HTMLCode"/>
-                <w:rFonts w:ascii="Arial" w:eastAsiaTheme="minorHAnsi" w:hAnsi="Arial" w:cs="Arial"/>
+                <w:b/>
+                <w:bCs/>
+                <w:sz w:val="16"/>
+                <w:szCs w:val="16"/>
+              </w:rPr>
+            </w:pPr>
+            <w:r>
+              <w:rPr>
+                <w:rStyle w:val="HTMLCode"/>
+                <w:rFonts w:ascii="Arial" w:eastAsiaTheme="minorHAnsi" w:hAnsi="Arial" w:cs="Arial"/>
+                <w:b/>
+                <w:bCs/>
                 <w:sz w:val="16"/>
                 <w:szCs w:val="16"/>
               </w:rPr>
@@ -1074,6 +1078,8 @@
               <w:rPr>
                 <w:rStyle w:val="HTMLCode"/>
                 <w:rFonts w:ascii="Arial" w:eastAsiaTheme="minorHAnsi" w:hAnsi="Arial" w:cs="Arial"/>
+                <w:b/>
+                <w:bCs/>
                 <w:sz w:val="16"/>
                 <w:szCs w:val="16"/>
               </w:rPr>
@@ -1083,6 +1089,8 @@
               <w:rPr>
                 <w:rStyle w:val="HTMLCode"/>
                 <w:rFonts w:ascii="Arial" w:eastAsiaTheme="minorHAnsi" w:hAnsi="Arial" w:cs="Arial"/>
+                <w:b/>
+                <w:bCs/>
                 <w:sz w:val="16"/>
                 <w:szCs w:val="16"/>
               </w:rPr>
@@ -1093,6 +1101,8 @@
               <w:rPr>
                 <w:rStyle w:val="HTMLCode"/>
                 <w:rFonts w:ascii="Arial" w:eastAsiaTheme="minorHAnsi" w:hAnsi="Arial" w:cs="Arial"/>
+                <w:b/>
+                <w:bCs/>
                 <w:sz w:val="16"/>
                 <w:szCs w:val="16"/>
               </w:rPr>
@@ -1102,6 +1112,8 @@
               <w:rPr>
                 <w:rStyle w:val="HTMLCode"/>
                 <w:rFonts w:ascii="Arial" w:eastAsiaTheme="minorHAnsi" w:hAnsi="Arial" w:cs="Arial"/>
+                <w:b/>
+                <w:bCs/>
                 <w:sz w:val="16"/>
                 <w:szCs w:val="16"/>
               </w:rPr>
@@ -1111,6 +1123,8 @@
               <w:rPr>
                 <w:rStyle w:val="HTMLCode"/>
                 <w:rFonts w:ascii="Arial" w:eastAsiaTheme="minorHAnsi" w:hAnsi="Arial" w:cs="Arial"/>
+                <w:b/>
+                <w:bCs/>
                 <w:color w:val="EE0000"/>
                 <w:sz w:val="16"/>
                 <w:szCs w:val="16"/>
@@ -1122,6 +1136,8 @@
               <w:rPr>
                 <w:rStyle w:val="HTMLCode"/>
                 <w:rFonts w:ascii="Arial" w:eastAsiaTheme="minorHAnsi" w:hAnsi="Arial" w:cs="Arial"/>
+                <w:b/>
+                <w:bCs/>
                 <w:color w:val="EE0000"/>
                 <w:sz w:val="16"/>
                 <w:szCs w:val="16"/>
@@ -1133,6 +1149,8 @@
               <w:rPr>
                 <w:rStyle w:val="HTMLCode"/>
                 <w:rFonts w:ascii="Arial" w:eastAsiaTheme="minorHAnsi" w:hAnsi="Arial" w:cs="Arial"/>
+                <w:b/>
+                <w:bCs/>
                 <w:color w:val="EE0000"/>
                 <w:sz w:val="16"/>
                 <w:szCs w:val="16"/>
@@ -1152,14 +1170,18 @@
               <w:jc w:val="center"/>
               <w:rPr>
                 <w:rFonts w:ascii="Arial" w:hAnsi="Arial" w:cs="Arial"/>
-                <w:sz w:val="16"/>
-                <w:szCs w:val="16"/>
-              </w:rPr>
-            </w:pPr>
-            <w:r>
-              <w:rPr>
-                <w:rStyle w:val="HTMLCode"/>
-                <w:rFonts w:ascii="Arial" w:eastAsiaTheme="minorHAnsi" w:hAnsi="Arial" w:cs="Arial"/>
+                <w:b/>
+                <w:bCs/>
+                <w:sz w:val="16"/>
+                <w:szCs w:val="16"/>
+              </w:rPr>
+            </w:pPr>
+            <w:r>
+              <w:rPr>
+                <w:rStyle w:val="HTMLCode"/>
+                <w:rFonts w:ascii="Arial" w:eastAsiaTheme="minorHAnsi" w:hAnsi="Arial" w:cs="Arial"/>
+                <w:b/>
+                <w:bCs/>
                 <w:sz w:val="16"/>
                 <w:szCs w:val="16"/>
               </w:rPr>
@@ -1170,6 +1192,8 @@
               <w:rPr>
                 <w:rStyle w:val="HTMLCode"/>
                 <w:rFonts w:ascii="Arial" w:eastAsiaTheme="minorHAnsi" w:hAnsi="Arial" w:cs="Arial"/>
+                <w:b/>
+                <w:bCs/>
                 <w:sz w:val="16"/>
                 <w:szCs w:val="16"/>
               </w:rPr>
@@ -1180,6 +1204,8 @@
               <w:rPr>
                 <w:rStyle w:val="HTMLCode"/>
                 <w:rFonts w:ascii="Arial" w:eastAsiaTheme="minorHAnsi" w:hAnsi="Arial" w:cs="Arial"/>
+                <w:b/>
+                <w:bCs/>
                 <w:sz w:val="16"/>
                 <w:szCs w:val="16"/>
               </w:rPr>
@@ -1198,14 +1224,18 @@
               <w:jc w:val="center"/>
               <w:rPr>
                 <w:rFonts w:ascii="Arial" w:hAnsi="Arial" w:cs="Arial"/>
-                <w:sz w:val="16"/>
-                <w:szCs w:val="16"/>
-              </w:rPr>
-            </w:pPr>
-            <w:r>
-              <w:rPr>
-                <w:rStyle w:val="HTMLCode"/>
-                <w:rFonts w:ascii="Arial" w:eastAsiaTheme="minorHAnsi" w:hAnsi="Arial" w:cs="Arial"/>
+                <w:b/>
+                <w:bCs/>
+                <w:sz w:val="16"/>
+                <w:szCs w:val="16"/>
+              </w:rPr>
+            </w:pPr>
+            <w:r>
+              <w:rPr>
+                <w:rStyle w:val="HTMLCode"/>
+                <w:rFonts w:ascii="Arial" w:eastAsiaTheme="minorHAnsi" w:hAnsi="Arial" w:cs="Arial"/>
+                <w:b/>
+                <w:bCs/>
                 <w:sz w:val="16"/>
                 <w:szCs w:val="16"/>
               </w:rPr>
@@ -1216,6 +1246,8 @@
               <w:rPr>
                 <w:rStyle w:val="HTMLCode"/>
                 <w:rFonts w:ascii="Arial" w:eastAsiaTheme="minorHAnsi" w:hAnsi="Arial" w:cs="Arial"/>
+                <w:b/>
+                <w:bCs/>
                 <w:sz w:val="16"/>
                 <w:szCs w:val="16"/>
               </w:rPr>
@@ -1226,6 +1258,8 @@
               <w:rPr>
                 <w:rStyle w:val="HTMLCode"/>
                 <w:rFonts w:ascii="Arial" w:eastAsiaTheme="minorHAnsi" w:hAnsi="Arial" w:cs="Arial"/>
+                <w:b/>
+                <w:bCs/>
                 <w:sz w:val="16"/>
                 <w:szCs w:val="16"/>
               </w:rPr>
@@ -1235,6 +1269,8 @@
               <w:rPr>
                 <w:rStyle w:val="HTMLCode"/>
                 <w:rFonts w:ascii="Arial" w:eastAsiaTheme="minorHAnsi" w:hAnsi="Arial" w:cs="Arial"/>
+                <w:b/>
+                <w:bCs/>
                 <w:sz w:val="16"/>
                 <w:szCs w:val="16"/>
               </w:rPr>
@@ -1244,6 +1280,8 @@
               <w:rPr>
                 <w:rStyle w:val="HTMLCode"/>
                 <w:rFonts w:ascii="Arial" w:eastAsiaTheme="minorHAnsi" w:hAnsi="Arial" w:cs="Arial"/>
+                <w:b/>
+                <w:bCs/>
                 <w:color w:val="EE0000"/>
                 <w:sz w:val="16"/>
                 <w:szCs w:val="16"/>
@@ -1255,6 +1293,8 @@
               <w:rPr>
                 <w:rStyle w:val="HTMLCode"/>
                 <w:rFonts w:ascii="Arial" w:eastAsiaTheme="minorHAnsi" w:hAnsi="Arial" w:cs="Arial"/>
+                <w:b/>
+                <w:bCs/>
                 <w:color w:val="EE0000"/>
                 <w:sz w:val="16"/>
                 <w:szCs w:val="16"/>
@@ -1266,6 +1306,8 @@
               <w:rPr>
                 <w:rStyle w:val="HTMLCode"/>
                 <w:rFonts w:ascii="Arial" w:eastAsiaTheme="minorHAnsi" w:hAnsi="Arial" w:cs="Arial"/>
+                <w:b/>
+                <w:bCs/>
                 <w:color w:val="EE0000"/>
                 <w:sz w:val="16"/>
                 <w:szCs w:val="16"/>
@@ -1285,14 +1327,18 @@
               <w:jc w:val="center"/>
               <w:rPr>
                 <w:rFonts w:ascii="Arial" w:hAnsi="Arial" w:cs="Arial"/>
-                <w:sz w:val="16"/>
-                <w:szCs w:val="16"/>
-              </w:rPr>
-            </w:pPr>
-            <w:r>
-              <w:rPr>
-                <w:rStyle w:val="HTMLCode"/>
-                <w:rFonts w:ascii="Arial" w:eastAsiaTheme="minorHAnsi" w:hAnsi="Arial" w:cs="Arial"/>
+                <w:b/>
+                <w:bCs/>
+                <w:sz w:val="16"/>
+                <w:szCs w:val="16"/>
+              </w:rPr>
+            </w:pPr>
+            <w:r>
+              <w:rPr>
+                <w:rStyle w:val="HTMLCode"/>
+                <w:rFonts w:ascii="Arial" w:eastAsiaTheme="minorHAnsi" w:hAnsi="Arial" w:cs="Arial"/>
+                <w:b/>
+                <w:bCs/>
                 <w:sz w:val="16"/>
                 <w:szCs w:val="16"/>
               </w:rPr>
@@ -1303,6 +1349,8 @@
               <w:rPr>
                 <w:rStyle w:val="HTMLCode"/>
                 <w:rFonts w:ascii="Arial" w:eastAsiaTheme="minorHAnsi" w:hAnsi="Arial" w:cs="Arial"/>
+                <w:b/>
+                <w:bCs/>
                 <w:sz w:val="16"/>
                 <w:szCs w:val="16"/>
               </w:rPr>
@@ -1313,6 +1361,8 @@
               <w:rPr>
                 <w:rStyle w:val="HTMLCode"/>
                 <w:rFonts w:ascii="Arial" w:eastAsiaTheme="minorHAnsi" w:hAnsi="Arial" w:cs="Arial"/>
+                <w:b/>
+                <w:bCs/>
                 <w:sz w:val="16"/>
                 <w:szCs w:val="16"/>
               </w:rPr>
@@ -1322,6 +1372,8 @@
               <w:rPr>
                 <w:rStyle w:val="HTMLCode"/>
                 <w:rFonts w:ascii="Arial" w:eastAsiaTheme="minorHAnsi" w:hAnsi="Arial" w:cs="Arial"/>
+                <w:b/>
+                <w:bCs/>
                 <w:sz w:val="16"/>
                 <w:szCs w:val="16"/>
               </w:rPr>
@@ -1331,6 +1383,8 @@
               <w:rPr>
                 <w:rStyle w:val="HTMLCode"/>
                 <w:rFonts w:ascii="Arial" w:eastAsiaTheme="minorHAnsi" w:hAnsi="Arial" w:cs="Arial"/>
+                <w:b/>
+                <w:bCs/>
                 <w:color w:val="EE0000"/>
                 <w:sz w:val="16"/>
                 <w:szCs w:val="16"/>
@@ -1342,6 +1396,8 @@
               <w:rPr>
                 <w:rStyle w:val="HTMLCode"/>
                 <w:rFonts w:ascii="Arial" w:eastAsiaTheme="minorHAnsi" w:hAnsi="Arial" w:cs="Arial"/>
+                <w:b/>
+                <w:bCs/>
                 <w:color w:val="EE0000"/>
                 <w:sz w:val="16"/>
                 <w:szCs w:val="16"/>
@@ -1353,6 +1409,8 @@
               <w:rPr>
                 <w:rStyle w:val="HTMLCode"/>
                 <w:rFonts w:ascii="Arial" w:eastAsiaTheme="minorHAnsi" w:hAnsi="Arial" w:cs="Arial"/>
+                <w:b/>
+                <w:bCs/>
                 <w:color w:val="EE0000"/>
                 <w:sz w:val="16"/>
                 <w:szCs w:val="16"/>
@@ -1372,14 +1430,18 @@
               <w:jc w:val="center"/>
               <w:rPr>
                 <w:rFonts w:ascii="Arial" w:hAnsi="Arial" w:cs="Arial"/>
-                <w:sz w:val="16"/>
-                <w:szCs w:val="16"/>
-              </w:rPr>
-            </w:pPr>
-            <w:r>
-              <w:rPr>
-                <w:rStyle w:val="HTMLCode"/>
-                <w:rFonts w:ascii="Arial" w:eastAsiaTheme="minorHAnsi" w:hAnsi="Arial" w:cs="Arial"/>
+                <w:b/>
+                <w:bCs/>
+                <w:sz w:val="16"/>
+                <w:szCs w:val="16"/>
+              </w:rPr>
+            </w:pPr>
+            <w:r>
+              <w:rPr>
+                <w:rStyle w:val="HTMLCode"/>
+                <w:rFonts w:ascii="Arial" w:eastAsiaTheme="minorHAnsi" w:hAnsi="Arial" w:cs="Arial"/>
+                <w:b/>
+                <w:bCs/>
                 <w:sz w:val="16"/>
                 <w:szCs w:val="16"/>
               </w:rPr>
@@ -1390,6 +1452,8 @@
               <w:rPr>
                 <w:rStyle w:val="HTMLCode"/>
                 <w:rFonts w:ascii="Arial" w:eastAsiaTheme="minorHAnsi" w:hAnsi="Arial" w:cs="Arial"/>
+                <w:b/>
+                <w:bCs/>
                 <w:sz w:val="16"/>
                 <w:szCs w:val="16"/>
               </w:rPr>
@@ -1400,6 +1464,8 @@
               <w:rPr>
                 <w:rStyle w:val="HTMLCode"/>
                 <w:rFonts w:ascii="Arial" w:eastAsiaTheme="minorHAnsi" w:hAnsi="Arial" w:cs="Arial"/>
+                <w:b/>
+                <w:bCs/>
                 <w:sz w:val="16"/>
                 <w:szCs w:val="16"/>
               </w:rPr>
@@ -1409,6 +1475,8 @@
               <w:rPr>
                 <w:rStyle w:val="HTMLCode"/>
                 <w:rFonts w:ascii="Arial" w:eastAsiaTheme="minorHAnsi" w:hAnsi="Arial" w:cs="Arial"/>
+                <w:b/>
+                <w:bCs/>
                 <w:sz w:val="16"/>
                 <w:szCs w:val="16"/>
               </w:rPr>
@@ -1418,6 +1486,8 @@
               <w:rPr>
                 <w:rStyle w:val="HTMLCode"/>
                 <w:rFonts w:ascii="Arial" w:eastAsiaTheme="minorHAnsi" w:hAnsi="Arial" w:cs="Arial"/>
+                <w:b/>
+                <w:bCs/>
                 <w:color w:val="EE0000"/>
                 <w:sz w:val="16"/>
                 <w:szCs w:val="16"/>
@@ -1429,6 +1499,8 @@
               <w:rPr>
                 <w:rStyle w:val="HTMLCode"/>
                 <w:rFonts w:ascii="Arial" w:eastAsiaTheme="minorHAnsi" w:hAnsi="Arial" w:cs="Arial"/>
+                <w:b/>
+                <w:bCs/>
                 <w:color w:val="EE0000"/>
                 <w:sz w:val="16"/>
                 <w:szCs w:val="16"/>
@@ -1440,6 +1512,8 @@
               <w:rPr>
                 <w:rStyle w:val="HTMLCode"/>
                 <w:rFonts w:ascii="Arial" w:eastAsiaTheme="minorHAnsi" w:hAnsi="Arial" w:cs="Arial"/>
+                <w:b/>
+                <w:bCs/>
                 <w:color w:val="EE0000"/>
                 <w:sz w:val="16"/>
                 <w:szCs w:val="16"/>
@@ -1459,6 +1533,8 @@
               <w:jc w:val="center"/>
               <w:rPr>
                 <w:rFonts w:ascii="Arial" w:hAnsi="Arial" w:cs="Arial"/>
+                <w:b/>
+                <w:bCs/>
                 <w:color w:val="EE0000"/>
                 <w:sz w:val="16"/>
                 <w:szCs w:val="16"/>
@@ -1468,6 +1544,8 @@
               <w:rPr>
                 <w:rStyle w:val="HTMLCode"/>
                 <w:rFonts w:ascii="Arial" w:eastAsiaTheme="minorHAnsi" w:hAnsi="Arial" w:cs="Arial"/>
+                <w:b/>
+                <w:bCs/>
                 <w:sz w:val="16"/>
                 <w:szCs w:val="16"/>
               </w:rPr>
@@ -1478,6 +1556,8 @@
               <w:rPr>
                 <w:rStyle w:val="HTMLCode"/>
                 <w:rFonts w:ascii="Arial" w:eastAsiaTheme="minorHAnsi" w:hAnsi="Arial" w:cs="Arial"/>
+                <w:b/>
+                <w:bCs/>
                 <w:sz w:val="16"/>
                 <w:szCs w:val="16"/>
               </w:rPr>
@@ -1487,6 +1567,8 @@
               <w:rPr>
                 <w:rStyle w:val="HTMLCode"/>
                 <w:rFonts w:ascii="Arial" w:eastAsiaTheme="minorHAnsi" w:hAnsi="Arial" w:cs="Arial"/>
+                <w:b/>
+                <w:bCs/>
                 <w:sz w:val="16"/>
                 <w:szCs w:val="16"/>
               </w:rPr>
@@ -1497,6 +1579,8 @@
               <w:rPr>
                 <w:rStyle w:val="HTMLCode"/>
                 <w:rFonts w:ascii="Arial" w:eastAsiaTheme="minorHAnsi" w:hAnsi="Arial" w:cs="Arial"/>
+                <w:b/>
+                <w:bCs/>
                 <w:sz w:val="16"/>
                 <w:szCs w:val="16"/>
               </w:rPr>
@@ -1506,6 +1590,8 @@
               <w:rPr>
                 <w:rStyle w:val="HTMLCode"/>
                 <w:rFonts w:ascii="Arial" w:eastAsiaTheme="minorHAnsi" w:hAnsi="Arial" w:cs="Arial"/>
+                <w:b/>
+                <w:bCs/>
                 <w:sz w:val="16"/>
                 <w:szCs w:val="16"/>
               </w:rPr>
@@ -1515,6 +1601,8 @@
               <w:rPr>
                 <w:rStyle w:val="HTMLCode"/>
                 <w:rFonts w:ascii="Arial" w:eastAsiaTheme="minorHAnsi" w:hAnsi="Arial" w:cs="Arial"/>
+                <w:b/>
+                <w:bCs/>
                 <w:color w:val="EE0000"/>
                 <w:sz w:val="16"/>
                 <w:szCs w:val="16"/>
@@ -1526,6 +1614,8 @@
               <w:rPr>
                 <w:rStyle w:val="HTMLCode"/>
                 <w:rFonts w:ascii="Arial" w:eastAsiaTheme="minorHAnsi" w:hAnsi="Arial" w:cs="Arial"/>
+                <w:b/>
+                <w:bCs/>
                 <w:color w:val="EE0000"/>
                 <w:sz w:val="16"/>
                 <w:szCs w:val="16"/>
@@ -1537,6 +1627,8 @@
               <w:rPr>
                 <w:rStyle w:val="HTMLCode"/>
                 <w:rFonts w:ascii="Arial" w:eastAsiaTheme="minorHAnsi" w:hAnsi="Arial" w:cs="Arial"/>
+                <w:b/>
+                <w:bCs/>
                 <w:color w:val="EE0000"/>
                 <w:sz w:val="16"/>
                 <w:szCs w:val="16"/>
@@ -1547,6 +1639,8 @@
               <w:rPr>
                 <w:rStyle w:val="HTMLCode"/>
                 <w:rFonts w:ascii="Arial" w:eastAsiaTheme="minorHAnsi" w:hAnsi="Arial" w:cs="Arial"/>
+                <w:b/>
+                <w:bCs/>
                 <w:color w:val="EE0000"/>
                 <w:sz w:val="16"/>
                 <w:szCs w:val="16"/>
@@ -1557,6 +1651,8 @@
               <w:rPr>
                 <w:rStyle w:val="HTMLCode"/>
                 <w:rFonts w:ascii="Arial" w:eastAsiaTheme="minorHAnsi" w:hAnsi="Arial" w:cs="Arial"/>
+                <w:b/>
+                <w:bCs/>
                 <w:sz w:val="16"/>
                 <w:szCs w:val="16"/>
               </w:rPr>

</xml_diff>

<commit_message>
Update Worker Roster Template on main.
Bring only the revised Word template into main so packaged releases include it.

Co-authored-by: fernandoqv1 <fernandoqv1@users.noreply.github.com>
</commit_message>
<xml_diff>
--- a/templates/Worker Roster Template.docx
+++ b/templates/Worker Roster Template.docx
@@ -1056,14 +1056,18 @@
               <w:jc w:val="center"/>
               <w:rPr>
                 <w:rFonts w:ascii="Arial" w:hAnsi="Arial" w:cs="Arial"/>
-                <w:sz w:val="16"/>
-                <w:szCs w:val="16"/>
-              </w:rPr>
-            </w:pPr>
-            <w:r>
-              <w:rPr>
-                <w:rStyle w:val="HTMLCode"/>
-                <w:rFonts w:ascii="Arial" w:eastAsiaTheme="minorHAnsi" w:hAnsi="Arial" w:cs="Arial"/>
+                <w:b/>
+                <w:bCs/>
+                <w:sz w:val="16"/>
+                <w:szCs w:val="16"/>
+              </w:rPr>
+            </w:pPr>
+            <w:r>
+              <w:rPr>
+                <w:rStyle w:val="HTMLCode"/>
+                <w:rFonts w:ascii="Arial" w:eastAsiaTheme="minorHAnsi" w:hAnsi="Arial" w:cs="Arial"/>
+                <w:b/>
+                <w:bCs/>
                 <w:sz w:val="16"/>
                 <w:szCs w:val="16"/>
               </w:rPr>
@@ -1074,6 +1078,8 @@
               <w:rPr>
                 <w:rStyle w:val="HTMLCode"/>
                 <w:rFonts w:ascii="Arial" w:eastAsiaTheme="minorHAnsi" w:hAnsi="Arial" w:cs="Arial"/>
+                <w:b/>
+                <w:bCs/>
                 <w:sz w:val="16"/>
                 <w:szCs w:val="16"/>
               </w:rPr>
@@ -1083,6 +1089,8 @@
               <w:rPr>
                 <w:rStyle w:val="HTMLCode"/>
                 <w:rFonts w:ascii="Arial" w:eastAsiaTheme="minorHAnsi" w:hAnsi="Arial" w:cs="Arial"/>
+                <w:b/>
+                <w:bCs/>
                 <w:sz w:val="16"/>
                 <w:szCs w:val="16"/>
               </w:rPr>
@@ -1093,6 +1101,8 @@
               <w:rPr>
                 <w:rStyle w:val="HTMLCode"/>
                 <w:rFonts w:ascii="Arial" w:eastAsiaTheme="minorHAnsi" w:hAnsi="Arial" w:cs="Arial"/>
+                <w:b/>
+                <w:bCs/>
                 <w:sz w:val="16"/>
                 <w:szCs w:val="16"/>
               </w:rPr>
@@ -1102,6 +1112,8 @@
               <w:rPr>
                 <w:rStyle w:val="HTMLCode"/>
                 <w:rFonts w:ascii="Arial" w:eastAsiaTheme="minorHAnsi" w:hAnsi="Arial" w:cs="Arial"/>
+                <w:b/>
+                <w:bCs/>
                 <w:sz w:val="16"/>
                 <w:szCs w:val="16"/>
               </w:rPr>
@@ -1111,6 +1123,8 @@
               <w:rPr>
                 <w:rStyle w:val="HTMLCode"/>
                 <w:rFonts w:ascii="Arial" w:eastAsiaTheme="minorHAnsi" w:hAnsi="Arial" w:cs="Arial"/>
+                <w:b/>
+                <w:bCs/>
                 <w:color w:val="EE0000"/>
                 <w:sz w:val="16"/>
                 <w:szCs w:val="16"/>
@@ -1122,6 +1136,8 @@
               <w:rPr>
                 <w:rStyle w:val="HTMLCode"/>
                 <w:rFonts w:ascii="Arial" w:eastAsiaTheme="minorHAnsi" w:hAnsi="Arial" w:cs="Arial"/>
+                <w:b/>
+                <w:bCs/>
                 <w:color w:val="EE0000"/>
                 <w:sz w:val="16"/>
                 <w:szCs w:val="16"/>
@@ -1133,6 +1149,8 @@
               <w:rPr>
                 <w:rStyle w:val="HTMLCode"/>
                 <w:rFonts w:ascii="Arial" w:eastAsiaTheme="minorHAnsi" w:hAnsi="Arial" w:cs="Arial"/>
+                <w:b/>
+                <w:bCs/>
                 <w:color w:val="EE0000"/>
                 <w:sz w:val="16"/>
                 <w:szCs w:val="16"/>
@@ -1152,14 +1170,18 @@
               <w:jc w:val="center"/>
               <w:rPr>
                 <w:rFonts w:ascii="Arial" w:hAnsi="Arial" w:cs="Arial"/>
-                <w:sz w:val="16"/>
-                <w:szCs w:val="16"/>
-              </w:rPr>
-            </w:pPr>
-            <w:r>
-              <w:rPr>
-                <w:rStyle w:val="HTMLCode"/>
-                <w:rFonts w:ascii="Arial" w:eastAsiaTheme="minorHAnsi" w:hAnsi="Arial" w:cs="Arial"/>
+                <w:b/>
+                <w:bCs/>
+                <w:sz w:val="16"/>
+                <w:szCs w:val="16"/>
+              </w:rPr>
+            </w:pPr>
+            <w:r>
+              <w:rPr>
+                <w:rStyle w:val="HTMLCode"/>
+                <w:rFonts w:ascii="Arial" w:eastAsiaTheme="minorHAnsi" w:hAnsi="Arial" w:cs="Arial"/>
+                <w:b/>
+                <w:bCs/>
                 <w:sz w:val="16"/>
                 <w:szCs w:val="16"/>
               </w:rPr>
@@ -1170,6 +1192,8 @@
               <w:rPr>
                 <w:rStyle w:val="HTMLCode"/>
                 <w:rFonts w:ascii="Arial" w:eastAsiaTheme="minorHAnsi" w:hAnsi="Arial" w:cs="Arial"/>
+                <w:b/>
+                <w:bCs/>
                 <w:sz w:val="16"/>
                 <w:szCs w:val="16"/>
               </w:rPr>
@@ -1180,6 +1204,8 @@
               <w:rPr>
                 <w:rStyle w:val="HTMLCode"/>
                 <w:rFonts w:ascii="Arial" w:eastAsiaTheme="minorHAnsi" w:hAnsi="Arial" w:cs="Arial"/>
+                <w:b/>
+                <w:bCs/>
                 <w:sz w:val="16"/>
                 <w:szCs w:val="16"/>
               </w:rPr>
@@ -1198,14 +1224,18 @@
               <w:jc w:val="center"/>
               <w:rPr>
                 <w:rFonts w:ascii="Arial" w:hAnsi="Arial" w:cs="Arial"/>
-                <w:sz w:val="16"/>
-                <w:szCs w:val="16"/>
-              </w:rPr>
-            </w:pPr>
-            <w:r>
-              <w:rPr>
-                <w:rStyle w:val="HTMLCode"/>
-                <w:rFonts w:ascii="Arial" w:eastAsiaTheme="minorHAnsi" w:hAnsi="Arial" w:cs="Arial"/>
+                <w:b/>
+                <w:bCs/>
+                <w:sz w:val="16"/>
+                <w:szCs w:val="16"/>
+              </w:rPr>
+            </w:pPr>
+            <w:r>
+              <w:rPr>
+                <w:rStyle w:val="HTMLCode"/>
+                <w:rFonts w:ascii="Arial" w:eastAsiaTheme="minorHAnsi" w:hAnsi="Arial" w:cs="Arial"/>
+                <w:b/>
+                <w:bCs/>
                 <w:sz w:val="16"/>
                 <w:szCs w:val="16"/>
               </w:rPr>
@@ -1216,6 +1246,8 @@
               <w:rPr>
                 <w:rStyle w:val="HTMLCode"/>
                 <w:rFonts w:ascii="Arial" w:eastAsiaTheme="minorHAnsi" w:hAnsi="Arial" w:cs="Arial"/>
+                <w:b/>
+                <w:bCs/>
                 <w:sz w:val="16"/>
                 <w:szCs w:val="16"/>
               </w:rPr>
@@ -1226,6 +1258,8 @@
               <w:rPr>
                 <w:rStyle w:val="HTMLCode"/>
                 <w:rFonts w:ascii="Arial" w:eastAsiaTheme="minorHAnsi" w:hAnsi="Arial" w:cs="Arial"/>
+                <w:b/>
+                <w:bCs/>
                 <w:sz w:val="16"/>
                 <w:szCs w:val="16"/>
               </w:rPr>
@@ -1235,6 +1269,8 @@
               <w:rPr>
                 <w:rStyle w:val="HTMLCode"/>
                 <w:rFonts w:ascii="Arial" w:eastAsiaTheme="minorHAnsi" w:hAnsi="Arial" w:cs="Arial"/>
+                <w:b/>
+                <w:bCs/>
                 <w:sz w:val="16"/>
                 <w:szCs w:val="16"/>
               </w:rPr>
@@ -1244,6 +1280,8 @@
               <w:rPr>
                 <w:rStyle w:val="HTMLCode"/>
                 <w:rFonts w:ascii="Arial" w:eastAsiaTheme="minorHAnsi" w:hAnsi="Arial" w:cs="Arial"/>
+                <w:b/>
+                <w:bCs/>
                 <w:color w:val="EE0000"/>
                 <w:sz w:val="16"/>
                 <w:szCs w:val="16"/>
@@ -1255,6 +1293,8 @@
               <w:rPr>
                 <w:rStyle w:val="HTMLCode"/>
                 <w:rFonts w:ascii="Arial" w:eastAsiaTheme="minorHAnsi" w:hAnsi="Arial" w:cs="Arial"/>
+                <w:b/>
+                <w:bCs/>
                 <w:color w:val="EE0000"/>
                 <w:sz w:val="16"/>
                 <w:szCs w:val="16"/>
@@ -1266,6 +1306,8 @@
               <w:rPr>
                 <w:rStyle w:val="HTMLCode"/>
                 <w:rFonts w:ascii="Arial" w:eastAsiaTheme="minorHAnsi" w:hAnsi="Arial" w:cs="Arial"/>
+                <w:b/>
+                <w:bCs/>
                 <w:color w:val="EE0000"/>
                 <w:sz w:val="16"/>
                 <w:szCs w:val="16"/>
@@ -1285,14 +1327,18 @@
               <w:jc w:val="center"/>
               <w:rPr>
                 <w:rFonts w:ascii="Arial" w:hAnsi="Arial" w:cs="Arial"/>
-                <w:sz w:val="16"/>
-                <w:szCs w:val="16"/>
-              </w:rPr>
-            </w:pPr>
-            <w:r>
-              <w:rPr>
-                <w:rStyle w:val="HTMLCode"/>
-                <w:rFonts w:ascii="Arial" w:eastAsiaTheme="minorHAnsi" w:hAnsi="Arial" w:cs="Arial"/>
+                <w:b/>
+                <w:bCs/>
+                <w:sz w:val="16"/>
+                <w:szCs w:val="16"/>
+              </w:rPr>
+            </w:pPr>
+            <w:r>
+              <w:rPr>
+                <w:rStyle w:val="HTMLCode"/>
+                <w:rFonts w:ascii="Arial" w:eastAsiaTheme="minorHAnsi" w:hAnsi="Arial" w:cs="Arial"/>
+                <w:b/>
+                <w:bCs/>
                 <w:sz w:val="16"/>
                 <w:szCs w:val="16"/>
               </w:rPr>
@@ -1303,6 +1349,8 @@
               <w:rPr>
                 <w:rStyle w:val="HTMLCode"/>
                 <w:rFonts w:ascii="Arial" w:eastAsiaTheme="minorHAnsi" w:hAnsi="Arial" w:cs="Arial"/>
+                <w:b/>
+                <w:bCs/>
                 <w:sz w:val="16"/>
                 <w:szCs w:val="16"/>
               </w:rPr>
@@ -1313,6 +1361,8 @@
               <w:rPr>
                 <w:rStyle w:val="HTMLCode"/>
                 <w:rFonts w:ascii="Arial" w:eastAsiaTheme="minorHAnsi" w:hAnsi="Arial" w:cs="Arial"/>
+                <w:b/>
+                <w:bCs/>
                 <w:sz w:val="16"/>
                 <w:szCs w:val="16"/>
               </w:rPr>
@@ -1322,6 +1372,8 @@
               <w:rPr>
                 <w:rStyle w:val="HTMLCode"/>
                 <w:rFonts w:ascii="Arial" w:eastAsiaTheme="minorHAnsi" w:hAnsi="Arial" w:cs="Arial"/>
+                <w:b/>
+                <w:bCs/>
                 <w:sz w:val="16"/>
                 <w:szCs w:val="16"/>
               </w:rPr>
@@ -1331,6 +1383,8 @@
               <w:rPr>
                 <w:rStyle w:val="HTMLCode"/>
                 <w:rFonts w:ascii="Arial" w:eastAsiaTheme="minorHAnsi" w:hAnsi="Arial" w:cs="Arial"/>
+                <w:b/>
+                <w:bCs/>
                 <w:color w:val="EE0000"/>
                 <w:sz w:val="16"/>
                 <w:szCs w:val="16"/>
@@ -1342,6 +1396,8 @@
               <w:rPr>
                 <w:rStyle w:val="HTMLCode"/>
                 <w:rFonts w:ascii="Arial" w:eastAsiaTheme="minorHAnsi" w:hAnsi="Arial" w:cs="Arial"/>
+                <w:b/>
+                <w:bCs/>
                 <w:color w:val="EE0000"/>
                 <w:sz w:val="16"/>
                 <w:szCs w:val="16"/>
@@ -1353,6 +1409,8 @@
               <w:rPr>
                 <w:rStyle w:val="HTMLCode"/>
                 <w:rFonts w:ascii="Arial" w:eastAsiaTheme="minorHAnsi" w:hAnsi="Arial" w:cs="Arial"/>
+                <w:b/>
+                <w:bCs/>
                 <w:color w:val="EE0000"/>
                 <w:sz w:val="16"/>
                 <w:szCs w:val="16"/>
@@ -1372,14 +1430,18 @@
               <w:jc w:val="center"/>
               <w:rPr>
                 <w:rFonts w:ascii="Arial" w:hAnsi="Arial" w:cs="Arial"/>
-                <w:sz w:val="16"/>
-                <w:szCs w:val="16"/>
-              </w:rPr>
-            </w:pPr>
-            <w:r>
-              <w:rPr>
-                <w:rStyle w:val="HTMLCode"/>
-                <w:rFonts w:ascii="Arial" w:eastAsiaTheme="minorHAnsi" w:hAnsi="Arial" w:cs="Arial"/>
+                <w:b/>
+                <w:bCs/>
+                <w:sz w:val="16"/>
+                <w:szCs w:val="16"/>
+              </w:rPr>
+            </w:pPr>
+            <w:r>
+              <w:rPr>
+                <w:rStyle w:val="HTMLCode"/>
+                <w:rFonts w:ascii="Arial" w:eastAsiaTheme="minorHAnsi" w:hAnsi="Arial" w:cs="Arial"/>
+                <w:b/>
+                <w:bCs/>
                 <w:sz w:val="16"/>
                 <w:szCs w:val="16"/>
               </w:rPr>
@@ -1390,6 +1452,8 @@
               <w:rPr>
                 <w:rStyle w:val="HTMLCode"/>
                 <w:rFonts w:ascii="Arial" w:eastAsiaTheme="minorHAnsi" w:hAnsi="Arial" w:cs="Arial"/>
+                <w:b/>
+                <w:bCs/>
                 <w:sz w:val="16"/>
                 <w:szCs w:val="16"/>
               </w:rPr>
@@ -1400,6 +1464,8 @@
               <w:rPr>
                 <w:rStyle w:val="HTMLCode"/>
                 <w:rFonts w:ascii="Arial" w:eastAsiaTheme="minorHAnsi" w:hAnsi="Arial" w:cs="Arial"/>
+                <w:b/>
+                <w:bCs/>
                 <w:sz w:val="16"/>
                 <w:szCs w:val="16"/>
               </w:rPr>
@@ -1409,6 +1475,8 @@
               <w:rPr>
                 <w:rStyle w:val="HTMLCode"/>
                 <w:rFonts w:ascii="Arial" w:eastAsiaTheme="minorHAnsi" w:hAnsi="Arial" w:cs="Arial"/>
+                <w:b/>
+                <w:bCs/>
                 <w:sz w:val="16"/>
                 <w:szCs w:val="16"/>
               </w:rPr>
@@ -1418,6 +1486,8 @@
               <w:rPr>
                 <w:rStyle w:val="HTMLCode"/>
                 <w:rFonts w:ascii="Arial" w:eastAsiaTheme="minorHAnsi" w:hAnsi="Arial" w:cs="Arial"/>
+                <w:b/>
+                <w:bCs/>
                 <w:color w:val="EE0000"/>
                 <w:sz w:val="16"/>
                 <w:szCs w:val="16"/>
@@ -1429,6 +1499,8 @@
               <w:rPr>
                 <w:rStyle w:val="HTMLCode"/>
                 <w:rFonts w:ascii="Arial" w:eastAsiaTheme="minorHAnsi" w:hAnsi="Arial" w:cs="Arial"/>
+                <w:b/>
+                <w:bCs/>
                 <w:color w:val="EE0000"/>
                 <w:sz w:val="16"/>
                 <w:szCs w:val="16"/>
@@ -1440,6 +1512,8 @@
               <w:rPr>
                 <w:rStyle w:val="HTMLCode"/>
                 <w:rFonts w:ascii="Arial" w:eastAsiaTheme="minorHAnsi" w:hAnsi="Arial" w:cs="Arial"/>
+                <w:b/>
+                <w:bCs/>
                 <w:color w:val="EE0000"/>
                 <w:sz w:val="16"/>
                 <w:szCs w:val="16"/>
@@ -1459,6 +1533,8 @@
               <w:jc w:val="center"/>
               <w:rPr>
                 <w:rFonts w:ascii="Arial" w:hAnsi="Arial" w:cs="Arial"/>
+                <w:b/>
+                <w:bCs/>
                 <w:color w:val="EE0000"/>
                 <w:sz w:val="16"/>
                 <w:szCs w:val="16"/>
@@ -1468,6 +1544,8 @@
               <w:rPr>
                 <w:rStyle w:val="HTMLCode"/>
                 <w:rFonts w:ascii="Arial" w:eastAsiaTheme="minorHAnsi" w:hAnsi="Arial" w:cs="Arial"/>
+                <w:b/>
+                <w:bCs/>
                 <w:sz w:val="16"/>
                 <w:szCs w:val="16"/>
               </w:rPr>
@@ -1478,6 +1556,8 @@
               <w:rPr>
                 <w:rStyle w:val="HTMLCode"/>
                 <w:rFonts w:ascii="Arial" w:eastAsiaTheme="minorHAnsi" w:hAnsi="Arial" w:cs="Arial"/>
+                <w:b/>
+                <w:bCs/>
                 <w:sz w:val="16"/>
                 <w:szCs w:val="16"/>
               </w:rPr>
@@ -1487,6 +1567,8 @@
               <w:rPr>
                 <w:rStyle w:val="HTMLCode"/>
                 <w:rFonts w:ascii="Arial" w:eastAsiaTheme="minorHAnsi" w:hAnsi="Arial" w:cs="Arial"/>
+                <w:b/>
+                <w:bCs/>
                 <w:sz w:val="16"/>
                 <w:szCs w:val="16"/>
               </w:rPr>
@@ -1497,6 +1579,8 @@
               <w:rPr>
                 <w:rStyle w:val="HTMLCode"/>
                 <w:rFonts w:ascii="Arial" w:eastAsiaTheme="minorHAnsi" w:hAnsi="Arial" w:cs="Arial"/>
+                <w:b/>
+                <w:bCs/>
                 <w:sz w:val="16"/>
                 <w:szCs w:val="16"/>
               </w:rPr>
@@ -1506,6 +1590,8 @@
               <w:rPr>
                 <w:rStyle w:val="HTMLCode"/>
                 <w:rFonts w:ascii="Arial" w:eastAsiaTheme="minorHAnsi" w:hAnsi="Arial" w:cs="Arial"/>
+                <w:b/>
+                <w:bCs/>
                 <w:sz w:val="16"/>
                 <w:szCs w:val="16"/>
               </w:rPr>
@@ -1515,6 +1601,8 @@
               <w:rPr>
                 <w:rStyle w:val="HTMLCode"/>
                 <w:rFonts w:ascii="Arial" w:eastAsiaTheme="minorHAnsi" w:hAnsi="Arial" w:cs="Arial"/>
+                <w:b/>
+                <w:bCs/>
                 <w:color w:val="EE0000"/>
                 <w:sz w:val="16"/>
                 <w:szCs w:val="16"/>
@@ -1526,6 +1614,8 @@
               <w:rPr>
                 <w:rStyle w:val="HTMLCode"/>
                 <w:rFonts w:ascii="Arial" w:eastAsiaTheme="minorHAnsi" w:hAnsi="Arial" w:cs="Arial"/>
+                <w:b/>
+                <w:bCs/>
                 <w:color w:val="EE0000"/>
                 <w:sz w:val="16"/>
                 <w:szCs w:val="16"/>
@@ -1537,6 +1627,8 @@
               <w:rPr>
                 <w:rStyle w:val="HTMLCode"/>
                 <w:rFonts w:ascii="Arial" w:eastAsiaTheme="minorHAnsi" w:hAnsi="Arial" w:cs="Arial"/>
+                <w:b/>
+                <w:bCs/>
                 <w:color w:val="EE0000"/>
                 <w:sz w:val="16"/>
                 <w:szCs w:val="16"/>
@@ -1547,6 +1639,8 @@
               <w:rPr>
                 <w:rStyle w:val="HTMLCode"/>
                 <w:rFonts w:ascii="Arial" w:eastAsiaTheme="minorHAnsi" w:hAnsi="Arial" w:cs="Arial"/>
+                <w:b/>
+                <w:bCs/>
                 <w:color w:val="EE0000"/>
                 <w:sz w:val="16"/>
                 <w:szCs w:val="16"/>
@@ -1557,6 +1651,8 @@
               <w:rPr>
                 <w:rStyle w:val="HTMLCode"/>
                 <w:rFonts w:ascii="Arial" w:eastAsiaTheme="minorHAnsi" w:hAnsi="Arial" w:cs="Arial"/>
+                <w:b/>
+                <w:bCs/>
                 <w:sz w:val="16"/>
                 <w:szCs w:val="16"/>
               </w:rPr>

</xml_diff>

<commit_message>
Update Worker Roster Template on main. (#5)
Bring only the revised Word template into main so packaged releases include it.

Co-authored-by: Cursor Agent <cursoragent@cursor.com>
Co-authored-by: fernandoqv1 <fernandoqv1@users.noreply.github.com>
</commit_message>
<xml_diff>
--- a/templates/Worker Roster Template.docx
+++ b/templates/Worker Roster Template.docx
@@ -1056,14 +1056,18 @@
               <w:jc w:val="center"/>
               <w:rPr>
                 <w:rFonts w:ascii="Arial" w:hAnsi="Arial" w:cs="Arial"/>
-                <w:sz w:val="16"/>
-                <w:szCs w:val="16"/>
-              </w:rPr>
-            </w:pPr>
-            <w:r>
-              <w:rPr>
-                <w:rStyle w:val="HTMLCode"/>
-                <w:rFonts w:ascii="Arial" w:eastAsiaTheme="minorHAnsi" w:hAnsi="Arial" w:cs="Arial"/>
+                <w:b/>
+                <w:bCs/>
+                <w:sz w:val="16"/>
+                <w:szCs w:val="16"/>
+              </w:rPr>
+            </w:pPr>
+            <w:r>
+              <w:rPr>
+                <w:rStyle w:val="HTMLCode"/>
+                <w:rFonts w:ascii="Arial" w:eastAsiaTheme="minorHAnsi" w:hAnsi="Arial" w:cs="Arial"/>
+                <w:b/>
+                <w:bCs/>
                 <w:sz w:val="16"/>
                 <w:szCs w:val="16"/>
               </w:rPr>
@@ -1074,6 +1078,8 @@
               <w:rPr>
                 <w:rStyle w:val="HTMLCode"/>
                 <w:rFonts w:ascii="Arial" w:eastAsiaTheme="minorHAnsi" w:hAnsi="Arial" w:cs="Arial"/>
+                <w:b/>
+                <w:bCs/>
                 <w:sz w:val="16"/>
                 <w:szCs w:val="16"/>
               </w:rPr>
@@ -1083,6 +1089,8 @@
               <w:rPr>
                 <w:rStyle w:val="HTMLCode"/>
                 <w:rFonts w:ascii="Arial" w:eastAsiaTheme="minorHAnsi" w:hAnsi="Arial" w:cs="Arial"/>
+                <w:b/>
+                <w:bCs/>
                 <w:sz w:val="16"/>
                 <w:szCs w:val="16"/>
               </w:rPr>
@@ -1093,6 +1101,8 @@
               <w:rPr>
                 <w:rStyle w:val="HTMLCode"/>
                 <w:rFonts w:ascii="Arial" w:eastAsiaTheme="minorHAnsi" w:hAnsi="Arial" w:cs="Arial"/>
+                <w:b/>
+                <w:bCs/>
                 <w:sz w:val="16"/>
                 <w:szCs w:val="16"/>
               </w:rPr>
@@ -1102,6 +1112,8 @@
               <w:rPr>
                 <w:rStyle w:val="HTMLCode"/>
                 <w:rFonts w:ascii="Arial" w:eastAsiaTheme="minorHAnsi" w:hAnsi="Arial" w:cs="Arial"/>
+                <w:b/>
+                <w:bCs/>
                 <w:sz w:val="16"/>
                 <w:szCs w:val="16"/>
               </w:rPr>
@@ -1111,6 +1123,8 @@
               <w:rPr>
                 <w:rStyle w:val="HTMLCode"/>
                 <w:rFonts w:ascii="Arial" w:eastAsiaTheme="minorHAnsi" w:hAnsi="Arial" w:cs="Arial"/>
+                <w:b/>
+                <w:bCs/>
                 <w:color w:val="EE0000"/>
                 <w:sz w:val="16"/>
                 <w:szCs w:val="16"/>
@@ -1122,6 +1136,8 @@
               <w:rPr>
                 <w:rStyle w:val="HTMLCode"/>
                 <w:rFonts w:ascii="Arial" w:eastAsiaTheme="minorHAnsi" w:hAnsi="Arial" w:cs="Arial"/>
+                <w:b/>
+                <w:bCs/>
                 <w:color w:val="EE0000"/>
                 <w:sz w:val="16"/>
                 <w:szCs w:val="16"/>
@@ -1133,6 +1149,8 @@
               <w:rPr>
                 <w:rStyle w:val="HTMLCode"/>
                 <w:rFonts w:ascii="Arial" w:eastAsiaTheme="minorHAnsi" w:hAnsi="Arial" w:cs="Arial"/>
+                <w:b/>
+                <w:bCs/>
                 <w:color w:val="EE0000"/>
                 <w:sz w:val="16"/>
                 <w:szCs w:val="16"/>
@@ -1152,14 +1170,18 @@
               <w:jc w:val="center"/>
               <w:rPr>
                 <w:rFonts w:ascii="Arial" w:hAnsi="Arial" w:cs="Arial"/>
-                <w:sz w:val="16"/>
-                <w:szCs w:val="16"/>
-              </w:rPr>
-            </w:pPr>
-            <w:r>
-              <w:rPr>
-                <w:rStyle w:val="HTMLCode"/>
-                <w:rFonts w:ascii="Arial" w:eastAsiaTheme="minorHAnsi" w:hAnsi="Arial" w:cs="Arial"/>
+                <w:b/>
+                <w:bCs/>
+                <w:sz w:val="16"/>
+                <w:szCs w:val="16"/>
+              </w:rPr>
+            </w:pPr>
+            <w:r>
+              <w:rPr>
+                <w:rStyle w:val="HTMLCode"/>
+                <w:rFonts w:ascii="Arial" w:eastAsiaTheme="minorHAnsi" w:hAnsi="Arial" w:cs="Arial"/>
+                <w:b/>
+                <w:bCs/>
                 <w:sz w:val="16"/>
                 <w:szCs w:val="16"/>
               </w:rPr>
@@ -1170,6 +1192,8 @@
               <w:rPr>
                 <w:rStyle w:val="HTMLCode"/>
                 <w:rFonts w:ascii="Arial" w:eastAsiaTheme="minorHAnsi" w:hAnsi="Arial" w:cs="Arial"/>
+                <w:b/>
+                <w:bCs/>
                 <w:sz w:val="16"/>
                 <w:szCs w:val="16"/>
               </w:rPr>
@@ -1180,6 +1204,8 @@
               <w:rPr>
                 <w:rStyle w:val="HTMLCode"/>
                 <w:rFonts w:ascii="Arial" w:eastAsiaTheme="minorHAnsi" w:hAnsi="Arial" w:cs="Arial"/>
+                <w:b/>
+                <w:bCs/>
                 <w:sz w:val="16"/>
                 <w:szCs w:val="16"/>
               </w:rPr>
@@ -1198,14 +1224,18 @@
               <w:jc w:val="center"/>
               <w:rPr>
                 <w:rFonts w:ascii="Arial" w:hAnsi="Arial" w:cs="Arial"/>
-                <w:sz w:val="16"/>
-                <w:szCs w:val="16"/>
-              </w:rPr>
-            </w:pPr>
-            <w:r>
-              <w:rPr>
-                <w:rStyle w:val="HTMLCode"/>
-                <w:rFonts w:ascii="Arial" w:eastAsiaTheme="minorHAnsi" w:hAnsi="Arial" w:cs="Arial"/>
+                <w:b/>
+                <w:bCs/>
+                <w:sz w:val="16"/>
+                <w:szCs w:val="16"/>
+              </w:rPr>
+            </w:pPr>
+            <w:r>
+              <w:rPr>
+                <w:rStyle w:val="HTMLCode"/>
+                <w:rFonts w:ascii="Arial" w:eastAsiaTheme="minorHAnsi" w:hAnsi="Arial" w:cs="Arial"/>
+                <w:b/>
+                <w:bCs/>
                 <w:sz w:val="16"/>
                 <w:szCs w:val="16"/>
               </w:rPr>
@@ -1216,6 +1246,8 @@
               <w:rPr>
                 <w:rStyle w:val="HTMLCode"/>
                 <w:rFonts w:ascii="Arial" w:eastAsiaTheme="minorHAnsi" w:hAnsi="Arial" w:cs="Arial"/>
+                <w:b/>
+                <w:bCs/>
                 <w:sz w:val="16"/>
                 <w:szCs w:val="16"/>
               </w:rPr>
@@ -1226,6 +1258,8 @@
               <w:rPr>
                 <w:rStyle w:val="HTMLCode"/>
                 <w:rFonts w:ascii="Arial" w:eastAsiaTheme="minorHAnsi" w:hAnsi="Arial" w:cs="Arial"/>
+                <w:b/>
+                <w:bCs/>
                 <w:sz w:val="16"/>
                 <w:szCs w:val="16"/>
               </w:rPr>
@@ -1235,6 +1269,8 @@
               <w:rPr>
                 <w:rStyle w:val="HTMLCode"/>
                 <w:rFonts w:ascii="Arial" w:eastAsiaTheme="minorHAnsi" w:hAnsi="Arial" w:cs="Arial"/>
+                <w:b/>
+                <w:bCs/>
                 <w:sz w:val="16"/>
                 <w:szCs w:val="16"/>
               </w:rPr>
@@ -1244,6 +1280,8 @@
               <w:rPr>
                 <w:rStyle w:val="HTMLCode"/>
                 <w:rFonts w:ascii="Arial" w:eastAsiaTheme="minorHAnsi" w:hAnsi="Arial" w:cs="Arial"/>
+                <w:b/>
+                <w:bCs/>
                 <w:color w:val="EE0000"/>
                 <w:sz w:val="16"/>
                 <w:szCs w:val="16"/>
@@ -1255,6 +1293,8 @@
               <w:rPr>
                 <w:rStyle w:val="HTMLCode"/>
                 <w:rFonts w:ascii="Arial" w:eastAsiaTheme="minorHAnsi" w:hAnsi="Arial" w:cs="Arial"/>
+                <w:b/>
+                <w:bCs/>
                 <w:color w:val="EE0000"/>
                 <w:sz w:val="16"/>
                 <w:szCs w:val="16"/>
@@ -1266,6 +1306,8 @@
               <w:rPr>
                 <w:rStyle w:val="HTMLCode"/>
                 <w:rFonts w:ascii="Arial" w:eastAsiaTheme="minorHAnsi" w:hAnsi="Arial" w:cs="Arial"/>
+                <w:b/>
+                <w:bCs/>
                 <w:color w:val="EE0000"/>
                 <w:sz w:val="16"/>
                 <w:szCs w:val="16"/>
@@ -1285,14 +1327,18 @@
               <w:jc w:val="center"/>
               <w:rPr>
                 <w:rFonts w:ascii="Arial" w:hAnsi="Arial" w:cs="Arial"/>
-                <w:sz w:val="16"/>
-                <w:szCs w:val="16"/>
-              </w:rPr>
-            </w:pPr>
-            <w:r>
-              <w:rPr>
-                <w:rStyle w:val="HTMLCode"/>
-                <w:rFonts w:ascii="Arial" w:eastAsiaTheme="minorHAnsi" w:hAnsi="Arial" w:cs="Arial"/>
+                <w:b/>
+                <w:bCs/>
+                <w:sz w:val="16"/>
+                <w:szCs w:val="16"/>
+              </w:rPr>
+            </w:pPr>
+            <w:r>
+              <w:rPr>
+                <w:rStyle w:val="HTMLCode"/>
+                <w:rFonts w:ascii="Arial" w:eastAsiaTheme="minorHAnsi" w:hAnsi="Arial" w:cs="Arial"/>
+                <w:b/>
+                <w:bCs/>
                 <w:sz w:val="16"/>
                 <w:szCs w:val="16"/>
               </w:rPr>
@@ -1303,6 +1349,8 @@
               <w:rPr>
                 <w:rStyle w:val="HTMLCode"/>
                 <w:rFonts w:ascii="Arial" w:eastAsiaTheme="minorHAnsi" w:hAnsi="Arial" w:cs="Arial"/>
+                <w:b/>
+                <w:bCs/>
                 <w:sz w:val="16"/>
                 <w:szCs w:val="16"/>
               </w:rPr>
@@ -1313,6 +1361,8 @@
               <w:rPr>
                 <w:rStyle w:val="HTMLCode"/>
                 <w:rFonts w:ascii="Arial" w:eastAsiaTheme="minorHAnsi" w:hAnsi="Arial" w:cs="Arial"/>
+                <w:b/>
+                <w:bCs/>
                 <w:sz w:val="16"/>
                 <w:szCs w:val="16"/>
               </w:rPr>
@@ -1322,6 +1372,8 @@
               <w:rPr>
                 <w:rStyle w:val="HTMLCode"/>
                 <w:rFonts w:ascii="Arial" w:eastAsiaTheme="minorHAnsi" w:hAnsi="Arial" w:cs="Arial"/>
+                <w:b/>
+                <w:bCs/>
                 <w:sz w:val="16"/>
                 <w:szCs w:val="16"/>
               </w:rPr>
@@ -1331,6 +1383,8 @@
               <w:rPr>
                 <w:rStyle w:val="HTMLCode"/>
                 <w:rFonts w:ascii="Arial" w:eastAsiaTheme="minorHAnsi" w:hAnsi="Arial" w:cs="Arial"/>
+                <w:b/>
+                <w:bCs/>
                 <w:color w:val="EE0000"/>
                 <w:sz w:val="16"/>
                 <w:szCs w:val="16"/>
@@ -1342,6 +1396,8 @@
               <w:rPr>
                 <w:rStyle w:val="HTMLCode"/>
                 <w:rFonts w:ascii="Arial" w:eastAsiaTheme="minorHAnsi" w:hAnsi="Arial" w:cs="Arial"/>
+                <w:b/>
+                <w:bCs/>
                 <w:color w:val="EE0000"/>
                 <w:sz w:val="16"/>
                 <w:szCs w:val="16"/>
@@ -1353,6 +1409,8 @@
               <w:rPr>
                 <w:rStyle w:val="HTMLCode"/>
                 <w:rFonts w:ascii="Arial" w:eastAsiaTheme="minorHAnsi" w:hAnsi="Arial" w:cs="Arial"/>
+                <w:b/>
+                <w:bCs/>
                 <w:color w:val="EE0000"/>
                 <w:sz w:val="16"/>
                 <w:szCs w:val="16"/>
@@ -1372,14 +1430,18 @@
               <w:jc w:val="center"/>
               <w:rPr>
                 <w:rFonts w:ascii="Arial" w:hAnsi="Arial" w:cs="Arial"/>
-                <w:sz w:val="16"/>
-                <w:szCs w:val="16"/>
-              </w:rPr>
-            </w:pPr>
-            <w:r>
-              <w:rPr>
-                <w:rStyle w:val="HTMLCode"/>
-                <w:rFonts w:ascii="Arial" w:eastAsiaTheme="minorHAnsi" w:hAnsi="Arial" w:cs="Arial"/>
+                <w:b/>
+                <w:bCs/>
+                <w:sz w:val="16"/>
+                <w:szCs w:val="16"/>
+              </w:rPr>
+            </w:pPr>
+            <w:r>
+              <w:rPr>
+                <w:rStyle w:val="HTMLCode"/>
+                <w:rFonts w:ascii="Arial" w:eastAsiaTheme="minorHAnsi" w:hAnsi="Arial" w:cs="Arial"/>
+                <w:b/>
+                <w:bCs/>
                 <w:sz w:val="16"/>
                 <w:szCs w:val="16"/>
               </w:rPr>
@@ -1390,6 +1452,8 @@
               <w:rPr>
                 <w:rStyle w:val="HTMLCode"/>
                 <w:rFonts w:ascii="Arial" w:eastAsiaTheme="minorHAnsi" w:hAnsi="Arial" w:cs="Arial"/>
+                <w:b/>
+                <w:bCs/>
                 <w:sz w:val="16"/>
                 <w:szCs w:val="16"/>
               </w:rPr>
@@ -1400,6 +1464,8 @@
               <w:rPr>
                 <w:rStyle w:val="HTMLCode"/>
                 <w:rFonts w:ascii="Arial" w:eastAsiaTheme="minorHAnsi" w:hAnsi="Arial" w:cs="Arial"/>
+                <w:b/>
+                <w:bCs/>
                 <w:sz w:val="16"/>
                 <w:szCs w:val="16"/>
               </w:rPr>
@@ -1409,6 +1475,8 @@
               <w:rPr>
                 <w:rStyle w:val="HTMLCode"/>
                 <w:rFonts w:ascii="Arial" w:eastAsiaTheme="minorHAnsi" w:hAnsi="Arial" w:cs="Arial"/>
+                <w:b/>
+                <w:bCs/>
                 <w:sz w:val="16"/>
                 <w:szCs w:val="16"/>
               </w:rPr>
@@ -1418,6 +1486,8 @@
               <w:rPr>
                 <w:rStyle w:val="HTMLCode"/>
                 <w:rFonts w:ascii="Arial" w:eastAsiaTheme="minorHAnsi" w:hAnsi="Arial" w:cs="Arial"/>
+                <w:b/>
+                <w:bCs/>
                 <w:color w:val="EE0000"/>
                 <w:sz w:val="16"/>
                 <w:szCs w:val="16"/>
@@ -1429,6 +1499,8 @@
               <w:rPr>
                 <w:rStyle w:val="HTMLCode"/>
                 <w:rFonts w:ascii="Arial" w:eastAsiaTheme="minorHAnsi" w:hAnsi="Arial" w:cs="Arial"/>
+                <w:b/>
+                <w:bCs/>
                 <w:color w:val="EE0000"/>
                 <w:sz w:val="16"/>
                 <w:szCs w:val="16"/>
@@ -1440,6 +1512,8 @@
               <w:rPr>
                 <w:rStyle w:val="HTMLCode"/>
                 <w:rFonts w:ascii="Arial" w:eastAsiaTheme="minorHAnsi" w:hAnsi="Arial" w:cs="Arial"/>
+                <w:b/>
+                <w:bCs/>
                 <w:color w:val="EE0000"/>
                 <w:sz w:val="16"/>
                 <w:szCs w:val="16"/>
@@ -1459,6 +1533,8 @@
               <w:jc w:val="center"/>
               <w:rPr>
                 <w:rFonts w:ascii="Arial" w:hAnsi="Arial" w:cs="Arial"/>
+                <w:b/>
+                <w:bCs/>
                 <w:color w:val="EE0000"/>
                 <w:sz w:val="16"/>
                 <w:szCs w:val="16"/>
@@ -1468,6 +1544,8 @@
               <w:rPr>
                 <w:rStyle w:val="HTMLCode"/>
                 <w:rFonts w:ascii="Arial" w:eastAsiaTheme="minorHAnsi" w:hAnsi="Arial" w:cs="Arial"/>
+                <w:b/>
+                <w:bCs/>
                 <w:sz w:val="16"/>
                 <w:szCs w:val="16"/>
               </w:rPr>
@@ -1478,6 +1556,8 @@
               <w:rPr>
                 <w:rStyle w:val="HTMLCode"/>
                 <w:rFonts w:ascii="Arial" w:eastAsiaTheme="minorHAnsi" w:hAnsi="Arial" w:cs="Arial"/>
+                <w:b/>
+                <w:bCs/>
                 <w:sz w:val="16"/>
                 <w:szCs w:val="16"/>
               </w:rPr>
@@ -1487,6 +1567,8 @@
               <w:rPr>
                 <w:rStyle w:val="HTMLCode"/>
                 <w:rFonts w:ascii="Arial" w:eastAsiaTheme="minorHAnsi" w:hAnsi="Arial" w:cs="Arial"/>
+                <w:b/>
+                <w:bCs/>
                 <w:sz w:val="16"/>
                 <w:szCs w:val="16"/>
               </w:rPr>
@@ -1497,6 +1579,8 @@
               <w:rPr>
                 <w:rStyle w:val="HTMLCode"/>
                 <w:rFonts w:ascii="Arial" w:eastAsiaTheme="minorHAnsi" w:hAnsi="Arial" w:cs="Arial"/>
+                <w:b/>
+                <w:bCs/>
                 <w:sz w:val="16"/>
                 <w:szCs w:val="16"/>
               </w:rPr>
@@ -1506,6 +1590,8 @@
               <w:rPr>
                 <w:rStyle w:val="HTMLCode"/>
                 <w:rFonts w:ascii="Arial" w:eastAsiaTheme="minorHAnsi" w:hAnsi="Arial" w:cs="Arial"/>
+                <w:b/>
+                <w:bCs/>
                 <w:sz w:val="16"/>
                 <w:szCs w:val="16"/>
               </w:rPr>
@@ -1515,6 +1601,8 @@
               <w:rPr>
                 <w:rStyle w:val="HTMLCode"/>
                 <w:rFonts w:ascii="Arial" w:eastAsiaTheme="minorHAnsi" w:hAnsi="Arial" w:cs="Arial"/>
+                <w:b/>
+                <w:bCs/>
                 <w:color w:val="EE0000"/>
                 <w:sz w:val="16"/>
                 <w:szCs w:val="16"/>
@@ -1526,6 +1614,8 @@
               <w:rPr>
                 <w:rStyle w:val="HTMLCode"/>
                 <w:rFonts w:ascii="Arial" w:eastAsiaTheme="minorHAnsi" w:hAnsi="Arial" w:cs="Arial"/>
+                <w:b/>
+                <w:bCs/>
                 <w:color w:val="EE0000"/>
                 <w:sz w:val="16"/>
                 <w:szCs w:val="16"/>
@@ -1537,6 +1627,8 @@
               <w:rPr>
                 <w:rStyle w:val="HTMLCode"/>
                 <w:rFonts w:ascii="Arial" w:eastAsiaTheme="minorHAnsi" w:hAnsi="Arial" w:cs="Arial"/>
+                <w:b/>
+                <w:bCs/>
                 <w:color w:val="EE0000"/>
                 <w:sz w:val="16"/>
                 <w:szCs w:val="16"/>
@@ -1547,6 +1639,8 @@
               <w:rPr>
                 <w:rStyle w:val="HTMLCode"/>
                 <w:rFonts w:ascii="Arial" w:eastAsiaTheme="minorHAnsi" w:hAnsi="Arial" w:cs="Arial"/>
+                <w:b/>
+                <w:bCs/>
                 <w:color w:val="EE0000"/>
                 <w:sz w:val="16"/>
                 <w:szCs w:val="16"/>
@@ -1557,6 +1651,8 @@
               <w:rPr>
                 <w:rStyle w:val="HTMLCode"/>
                 <w:rFonts w:ascii="Arial" w:eastAsiaTheme="minorHAnsi" w:hAnsi="Arial" w:cs="Arial"/>
+                <w:b/>
+                <w:bCs/>
                 <w:sz w:val="16"/>
                 <w:szCs w:val="16"/>
               </w:rPr>

</xml_diff>